<commit_message>
refactor: complete subflow refactor — simulator, schemas, Node-RED, infra
Rework simulator FSM, physics, tire/fuel model, race-controller triggers,
and MQTT publisher. Update JSON schemas, Mongo seed, Mosquitto ACL/config,
Node-RED flows and dashboard JS. Remove planning doc subflow-refactor.md.
</commit_message>
<xml_diff>
--- a/docs/report/f1_telemetry.docx
+++ b/docs/report/f1_telemetry.docx
@@ -7166,29 +7166,7 @@
           <w:szCs w:val="18"/>
           <w:lang w:val="en-GB"/>
         </w:rPr>
-        <w:t xml:space="preserve"> = -(</w:t>
-      </w:r>
-      <w:proofErr w:type="spellStart"/>
-      <w:r>
-        <w:rPr>
-          <w:rFonts w:ascii="Courier New" w:eastAsia="Courier New" w:hAnsi="Courier New" w:cs="Courier New"/>
-          <w:color w:val="2E4057"/>
-          <w:sz w:val="18"/>
-          <w:szCs w:val="18"/>
-          <w:lang w:val="en-GB"/>
-        </w:rPr>
-        <w:t>K_FUEL_BASE + K_FUEL_LOAD × (speed / 300)^2 × throttle</w:t>
-      </w:r>
-      <w:proofErr w:type="spellEnd"/>
-      <w:r>
-        <w:rPr>
-          <w:rFonts w:ascii="Courier New" w:eastAsia="Courier New" w:hAnsi="Courier New" w:cs="Courier New"/>
-          <w:color w:val="2E4057"/>
-          <w:sz w:val="18"/>
-          <w:szCs w:val="18"/>
-          <w:lang w:val="en-GB"/>
-        </w:rPr>
-        <w:t xml:space="preserve">) × dt</w:t>
+        <w:t xml:space="preserve"> = -(K_FUEL_BASE + K_FUEL_LOAD × (speed / 300)^2 × throttle) × dt</w:t>
       </w:r>
     </w:p>
     <w:p>
@@ -11840,10 +11818,16 @@
             </w:tcMar>
           </w:tcPr>
           <w:p>
-            <w:r>
-              <w:rPr>
-                <w:sz w:val="18"/>
-                <w:szCs w:val="18"/>
+            <w:pPr>
+              <w:rPr>
+                <w:lang w:val="en-GB"/>
+              </w:rPr>
+            </w:pPr>
+            <w:r>
+              <w:rPr>
+                <w:sz w:val="18"/>
+                <w:szCs w:val="18"/>
+                <w:lang w:val="en-GB"/>
               </w:rPr>
               <w:t>Shared catch endpoint for Node-RED flow errors; keeps catch/link handling on the parent tabs and routes errors to debug output.</w:t>
             </w:r>
@@ -11896,10 +11880,16 @@
             </w:tcMar>
           </w:tcPr>
           <w:p>
-            <w:r>
-              <w:rPr>
-                <w:sz w:val="18"/>
-                <w:szCs w:val="18"/>
+            <w:pPr>
+              <w:rPr>
+                <w:lang w:val="en-GB"/>
+              </w:rPr>
+            </w:pPr>
+            <w:r>
+              <w:rPr>
+                <w:sz w:val="18"/>
+                <w:szCs w:val="18"/>
+                <w:lang w:val="en-GB"/>
               </w:rPr>
               <w:t>Parses F1 MQTT topics, validates race/team/car metadata, normalizes timestamps, and emits an internal envelope plus an error output.</w:t>
             </w:r>
@@ -11952,10 +11942,16 @@
             </w:tcMar>
           </w:tcPr>
           <w:p>
-            <w:r>
-              <w:rPr>
-                <w:sz w:val="18"/>
-                <w:szCs w:val="18"/>
+            <w:pPr>
+              <w:rPr>
+                <w:lang w:val="en-GB"/>
+              </w:rPr>
+            </w:pPr>
+            <w:r>
+              <w:rPr>
+                <w:sz w:val="18"/>
+                <w:szCs w:val="18"/>
+                <w:lang w:val="en-GB"/>
               </w:rPr>
               <w:t>Detects tire overheat, low fuel, stationary-running, and track-position jump events from normalized telemetry.</w:t>
             </w:r>
@@ -11981,10 +11977,16 @@
             </w:tcMar>
           </w:tcPr>
           <w:p>
-            <w:r>
-              <w:rPr>
-                <w:sz w:val="18"/>
-                <w:szCs w:val="18"/>
+            <w:pPr>
+              <w:rPr>
+                <w:lang w:val="en-GB"/>
+              </w:rPr>
+            </w:pPr>
+            <w:r>
+              <w:rPr>
+                <w:sz w:val="18"/>
+                <w:szCs w:val="18"/>
+                <w:lang w:val="en-GB"/>
               </w:rPr>
               <w:t>SF - Race Control Flag Handler</w:t>
             </w:r>
@@ -12008,10 +12010,16 @@
             </w:tcMar>
           </w:tcPr>
           <w:p>
-            <w:r>
-              <w:rPr>
-                <w:sz w:val="18"/>
-                <w:szCs w:val="18"/>
+            <w:pPr>
+              <w:rPr>
+                <w:lang w:val="en-GB"/>
+              </w:rPr>
+            </w:pPr>
+            <w:r>
+              <w:rPr>
+                <w:sz w:val="18"/>
+                <w:szCs w:val="18"/>
+                <w:lang w:val="en-GB"/>
               </w:rPr>
               <w:t>Validates race-control flags, stores current flag and derived race effects, and emits dashboard, MongoDB, effects, and error messages.</w:t>
             </w:r>
@@ -12064,10 +12072,16 @@
             </w:tcMar>
           </w:tcPr>
           <w:p>
-            <w:r>
-              <w:rPr>
-                <w:sz w:val="18"/>
-                <w:szCs w:val="18"/>
+            <w:pPr>
+              <w:rPr>
+                <w:lang w:val="en-GB"/>
+              </w:rPr>
+            </w:pPr>
+            <w:r>
+              <w:rPr>
+                <w:sz w:val="18"/>
+                <w:szCs w:val="18"/>
+                <w:lang w:val="en-GB"/>
               </w:rPr>
               <w:t>Encrypts dashboard race-control flag commands with AES-256-GCM before publishing to the secure MQTT topic.</w:t>
             </w:r>
@@ -12120,10 +12134,16 @@
             </w:tcMar>
           </w:tcPr>
           <w:p>
-            <w:r>
-              <w:rPr>
-                <w:sz w:val="18"/>
-                <w:szCs w:val="18"/>
+            <w:pPr>
+              <w:rPr>
+                <w:lang w:val="en-GB"/>
+              </w:rPr>
+            </w:pPr>
+            <w:r>
+              <w:rPr>
+                <w:sz w:val="18"/>
+                <w:szCs w:val="18"/>
+                <w:lang w:val="en-GB"/>
               </w:rPr>
               <w:t>Decrypts secure race-control flag messages and restores the clear race-control topic for normal processing.</w:t>
             </w:r>
@@ -12176,10 +12196,16 @@
             </w:tcMar>
           </w:tcPr>
           <w:p>
-            <w:r>
-              <w:rPr>
-                <w:sz w:val="18"/>
-                <w:szCs w:val="18"/>
+            <w:pPr>
+              <w:rPr>
+                <w:lang w:val="en-GB"/>
+              </w:rPr>
+            </w:pPr>
+            <w:r>
+              <w:rPr>
+                <w:sz w:val="18"/>
+                <w:szCs w:val="18"/>
+                <w:lang w:val="en-GB"/>
               </w:rPr>
               <w:t>Routes WebSocket dashboard commands to flag, start-scenario, stop-race, and merged error outputs.</w:t>
             </w:r>
@@ -12190,8 +12216,14 @@
     <w:p>
       <w:pPr>
         <w:spacing w:after="80"/>
-      </w:pPr>
-      <w:r>
+        <w:rPr>
+          <w:lang w:val="en-GB"/>
+        </w:rPr>
+      </w:pPr>
+      <w:r>
+        <w:rPr>
+          <w:lang w:val="en-GB"/>
+        </w:rPr>
         <w:t>Stateful caches, MongoDB write nodes, link nodes, MQTT, WebSocket, inject, and catch nodes remain on the parent tabs; the subflows above wrap transformation, validation, routing, and security logic.</w:t>
       </w:r>
     </w:p>
@@ -13006,6 +13038,7 @@
         <w:rPr>
           <w:lang w:val="en-GB"/>
         </w:rPr>
+        <w:lastRenderedPageBreak/>
         <w:t>telemetry: (</w:t>
       </w:r>
       <w:proofErr w:type="spellStart"/>
@@ -13273,7 +13306,6 @@
         <w:rPr>
           <w:lang w:val="en-GB"/>
         </w:rPr>
-        <w:lastRenderedPageBreak/>
         <w:t>validationLevel</w:t>
       </w:r>
       <w:proofErr w:type="spellEnd"/>
@@ -13724,6 +13756,7 @@
         <w:rPr>
           <w:lang w:val="en-GB"/>
         </w:rPr>
+        <w:lastRenderedPageBreak/>
         <w:t>Each animation frame advances the car along the SVG path proportionally to elapsed time</w:t>
       </w:r>
     </w:p>
@@ -14001,7 +14034,6 @@
         <w:rPr>
           <w:lang w:val="en-GB"/>
         </w:rPr>
-        <w:lastRenderedPageBreak/>
         <w:t xml:space="preserve">The simulated sensor suite covers both </w:t>
       </w:r>
       <w:proofErr w:type="spellStart"/>
@@ -18093,6 +18125,17 @@
       <w:pPr>
         <w:jc w:val="center"/>
         <w:rPr>
+          <w:i/>
+          <w:color w:val="666666"/>
+          <w:sz w:val="18"/>
+          <w:lang w:val="en-GB"/>
+        </w:rPr>
+      </w:pPr>
+    </w:p>
+    <w:p>
+      <w:pPr>
+        <w:jc w:val="center"/>
+        <w:rPr>
           <w:lang w:val="en-GB"/>
         </w:rPr>
       </w:pPr>
@@ -19479,6 +19522,7 @@
           <w:szCs w:val="18"/>
           <w:lang w:val="en-GB"/>
         </w:rPr>
+        <w:lastRenderedPageBreak/>
         <w:t xml:space="preserve">  return null;</w:t>
       </w:r>
     </w:p>
@@ -19500,7 +19544,6 @@
           <w:szCs w:val="18"/>
           <w:lang w:val="en-GB"/>
         </w:rPr>
-        <w:lastRenderedPageBreak/>
         <w:t>}</w:t>
       </w:r>
     </w:p>
@@ -19951,6 +19994,7 @@
         <w:rPr>
           <w:lang w:val="en-GB"/>
         </w:rPr>
+        <w:lastRenderedPageBreak/>
         <w:t>11.6 Node-RED for Stream Processing</w:t>
       </w:r>
     </w:p>
@@ -19967,7 +20011,6 @@
           <w:bCs/>
           <w:lang w:val="en-GB"/>
         </w:rPr>
-        <w:lastRenderedPageBreak/>
         <w:t xml:space="preserve">Decision: </w:t>
       </w:r>
       <w:r>

</xml_diff>